<commit_message>
Add the sign for "you", and retire the trap it created
One clip, and the one that was most worth having. "you" had no sign, so
"Do you have pain?" — the most natural question a doctor could type —
refused, and the notes had to warn about it in a box of its own. Thirteen
ordinary questions work now that did not this morning.

It arrived in docs/talk again, which is tracked, so it moved to clips
before anything else happened.

The notes' trap box is replaced rather than deleted, because the sharper
trap underneath it is now visible: "Do you have fever?" plays one filmed
clip and "Do you have a fever?" refuses, since "fever" and "severe" exist
only inside their questions and not as words. One small word decides it,
so the box now says to read the questions off the page rather than from
memory, and the do-not-type table lists what actually refuses today:
take, need, it, pregnant, malaria, cough, body parts.

Co-Authored-By: Claude Opus 5 <noreply@anthropic.com>
</commit_message>
<xml_diff>
--- a/docs/talk/tie-me-ghana-demo-briefing.docx
+++ b/docs/talk/tie-me-ghana-demo-briefing.docx
@@ -1610,7 +1610,7 @@
               <w:spacing w:after="0"/>
             </w:pPr>
             <w:r>
-              <w:t xml:space="preserve">107 reviewed GhSL clips; refusal when a sentence cannot be signed safely</w:t>
+              <w:t xml:space="preserve">108 reviewed GhSL clips; refusal when a sentence cannot be signed safely</w:t>
             </w:r>
           </w:p>
         </w:tc>
@@ -2830,7 +2830,7 @@
               <w:spacing w:after="0"/>
             </w:pPr>
             <w:r>
-              <w:t xml:space="preserve">107</w:t>
+              <w:t xml:space="preserve">108</w:t>
             </w:r>
           </w:p>
         </w:tc>
@@ -2849,7 +2849,7 @@
               <w:spacing w:after="0"/>
             </w:pPr>
             <w:r>
-              <w:t xml:space="preserve">Reviewed GhSL clips live: 72 words, 17 phrases, 16 letters and digits, 2 emergency alerts</w:t>
+              <w:t xml:space="preserve">Reviewed GhSL clips live: 73 words, 17 phrases, 16 letters and digits, 2 emergency alerts</w:t>
             </w:r>
           </w:p>
         </w:tc>
@@ -3189,7 +3189,7 @@
         <w:spacing w:after="120"/>
       </w:pPr>
       <w:r>
-        <w:t xml:space="preserve">These resolve against the 107 clips we have. Anything outside this vocabulary may correctly refuse.</w:t>
+        <w:t xml:space="preserve">These resolve against the 108 clips we have. Anything outside this vocabulary may correctly refuse.</w:t>
       </w:r>
     </w:p>
     <w:p>

</xml_diff>